<commit_message>
docs: refine submission document closing section
</commit_message>
<xml_diff>
--- a/docs/T3N-Submission.docx
+++ b/docs/T3N-Submission.docx
@@ -1120,57 +1120,17 @@
         <w:pStyle w:val="Heading1"/>
       </w:pPr>
       <w:r>
-        <w:t>11. Submission checklist</w:t>
-      </w:r>
-    </w:p>
-    <w:p>
-      <w:pPr>
-        <w:pStyle w:val="ListBullet"/>
-        <w:spacing w:after="40"/>
-      </w:pPr>
-      <w:r>
-        <w:t>Public GitHub repository: complete.</w:t>
-      </w:r>
-    </w:p>
-    <w:p>
-      <w:pPr>
-        <w:pStyle w:val="ListBullet"/>
-        <w:spacing w:after="40"/>
-      </w:pPr>
-      <w:r>
-        <w:t>Screenshots embedded in this document: complete.</w:t>
-      </w:r>
-    </w:p>
-    <w:p>
-      <w:pPr>
-        <w:pStyle w:val="ListBullet"/>
-        <w:spacing w:after="40"/>
-      </w:pPr>
-      <w:r>
-        <w:t>Bug findings documented: complete.</w:t>
-      </w:r>
-    </w:p>
-    <w:p>
-      <w:pPr>
-        <w:pStyle w:val="ListBullet"/>
-        <w:spacing w:after="40"/>
-      </w:pPr>
-      <w:r>
-        <w:t>Public Google Doc: upload this .docx to Google Docs, then set General access to Anyone with the link and Viewer.</w:t>
-      </w:r>
-    </w:p>
-    <w:p>
-      <w:pPr>
-        <w:pStyle w:val="ListBullet"/>
-        <w:spacing w:after="40"/>
-      </w:pPr>
-      <w:r>
-        <w:t>Superteam Earn submission: paste the public Google Doc URL and repository URL into the submission form.</w:t>
+        <w:t>11. Closing statement</w:t>
       </w:r>
     </w:p>
     <w:p>
       <w:r>
-        <w:t>All examples use synthetic invoice data. No private customer or financial records are included.</w:t>
+        <w:t>This project prioritizes a narrow enterprise workflow that can be inspected, tested, and maintained. The T3N contract keeps policy and duplicate state inside the trusted execution environment, while the application agent receives only the decision data required for its task.</w:t>
+      </w:r>
+    </w:p>
+    <w:p>
+      <w:r>
+        <w:t>The implementation is backed by local unit tests, Rust contract tests, a reproducible WASM build, live testnet verification, delegated authorization checks, and a least privilege grant. All examples use synthetic invoice data. No private customer or financial records are included.</w:t>
       </w:r>
     </w:p>
     <w:sectPr>

</xml_diff>